<commit_message>
Add version markers to proposal documents
Co-authored-by: arena-agent <297053741+arena-agent@users.noreply.github.com>
</commit_message>
<xml_diff>
--- a/公选课/02_AI数字人短视频制作_申报表.docx
+++ b/公选课/02_AI数字人短视频制作_申报表.docx
@@ -1739,7 +1739,7 @@
           <w:sz w:val="32"/>
           <w:szCs w:val="32"/>
         </w:rPr>
-        <w:t>石家庄邮电职业技</w:t>
+        <w:t>石家庄邮电职业技术学院公共选修课申报表（V1.0）</w:t>
       </w:r>
       <w:bookmarkStart w:id="7" w:name="_GoBack"/>
       <w:bookmarkEnd w:id="7"/>
@@ -1750,7 +1750,7 @@
           <w:sz w:val="32"/>
           <w:szCs w:val="32"/>
         </w:rPr>
-        <w:t>术学院公共选修课申报表</w:t>
+        <w:t/>
       </w:r>
     </w:p>
     <w:tbl>

</xml_diff>